<commit_message>
Update resume to match portfolio
</commit_message>
<xml_diff>
--- a/public/Jamal_Mammadzada_Resume.docx
+++ b/public/Jamal_Mammadzada_Resume.docx
@@ -97,7 +97,7 @@
           <w:color w:val="1B222A"/>
           <w:sz w:val="17"/>
         </w:rPr>
-        <w:t>High school researcher and engineer building auditable systems from noisy, real-world data. Develops computer-vision pipelines, security automation, and full-stack analytical tools with human review, confidence-aware outputs, and reproducible evaluation. Interested in knowledge extraction, visual analytics, and reliable AI research infrastructure.</w:t>
+        <w:t>High school researcher and engineer building auditable systems from noisy, real-world data. Develops competition-deployed computer-vision tools, security automation, robotics education systems, and independent mathematics research with an emphasis on reviewable evidence and reproducible evaluation.</w:t>
       </w:r>
     </w:p>
     <w:p>
@@ -147,7 +147,7 @@
           <w:sz w:val="16"/>
         </w:rPr>
         <w:tab/>
-        <w:t>2024-Present</w:t>
+        <w:t>February 2026-Present</w:t>
       </w:r>
     </w:p>
     <w:p>
@@ -167,7 +167,7 @@
           <w:color w:val="1B222A"/>
           <w:sz w:val="17"/>
         </w:rPr>
-        <w:t>Built a full-stack FIRST Robotics analysis platform that detects and tracks robots in match video, maps camera observations into field coordinates, and converts footage into reviewable strategic evidence.</w:t>
+        <w:t>Built and deployed an open-source, full-stack scouting and match-analysis platform used by FRC Team 5417 at a real competition; supports multi-scout data collection, offline submissions, strategy analysis, and mobile-first workflows.</w:t>
       </w:r>
     </w:p>
     <w:p>
@@ -187,7 +187,7 @@
           <w:color w:val="1B222A"/>
           <w:sz w:val="17"/>
         </w:rPr>
-        <w:t>Designed a human-in-the-loop pipeline: model outputs retain confidence, and scouts approve, correct, or reject results before they become accepted data; stack includes Python, FastAPI, React, PostgreSQL, Redis, Docker, YOLO, ByteTrack, OpenCV, OCR, and ONNX Runtime Web.</w:t>
+        <w:t>Developing a computer-vision auto-scouting pipeline that detects and tracks robots in match video, maps observations into field coordinates, and retains confidence and human review before model outputs become accepted data.</w:t>
       </w:r>
     </w:p>
     <w:p>
@@ -263,6 +263,57 @@
     </w:p>
     <w:p>
       <w:pPr>
+        <w:pStyle w:val="RoleLine"/>
+        <w:tabs>
+          <w:tab w:pos="10440" w:val="right"/>
+        </w:tabs>
+      </w:pPr>
+      <w:r>
+        <w:rPr>
+          <w:rFonts w:ascii="Arial" w:hAnsi="Arial"/>
+          <w:b/>
+          <w:i w:val="0"/>
+          <w:caps w:val="0"/>
+          <w:color w:val="1B222A"/>
+          <w:sz w:val="17"/>
+        </w:rPr>
+        <w:t>Practical Cryptography - Course Author</w:t>
+      </w:r>
+      <w:r>
+        <w:rPr>
+          <w:rFonts w:ascii="Arial" w:hAnsi="Arial"/>
+          <w:b/>
+          <w:i w:val="0"/>
+          <w:caps w:val="0"/>
+          <w:color w:val="5B6672"/>
+          <w:sz w:val="16"/>
+        </w:rPr>
+        <w:tab/>
+        <w:t>2026</w:t>
+      </w:r>
+    </w:p>
+    <w:p>
+      <w:pPr>
+        <w:pStyle w:val="ResumeBullet"/>
+        <w:numPr>
+          <w:ilvl w:val="0"/>
+          <w:numId w:val="91"/>
+        </w:numPr>
+      </w:pPr>
+      <w:r>
+        <w:rPr>
+          <w:rFonts w:ascii="Arial" w:hAnsi="Arial"/>
+          <w:b w:val="0"/>
+          <w:i w:val="0"/>
+          <w:caps w:val="0"/>
+          <w:color w:val="1B222A"/>
+          <w:sz w:val="17"/>
+        </w:rPr>
+        <w:t>Authored a 43-lecture course across 16 sections with 16 exercises and a deliberately vulnerable capstone assessed through hidden and mutation-based tests; students preserve evidence and make a defensible release decision.</w:t>
+      </w:r>
+    </w:p>
+    <w:p>
+      <w:pPr>
         <w:pStyle w:val="Heading1"/>
         <w:pBdr>
           <w:bottom w:val="single" w:sz="9" w:space="2" w:color="2563EB"/>
@@ -296,7 +347,7 @@
           <w:color w:val="1B222A"/>
           <w:sz w:val="17"/>
         </w:rPr>
-        <w:t>Analytical Solvability of One-Dimensional SDEs - IB Mathematics Extended Essay</w:t>
+        <w:t>Analytical Solvability of One-Dimensional SDEs - Independent Research</w:t>
       </w:r>
       <w:r>
         <w:rPr>
@@ -308,7 +359,7 @@
           <w:sz w:val="16"/>
         </w:rPr>
         <w:tab/>
-        <w:t>2026</w:t>
+        <w:t>2026-Present</w:t>
       </w:r>
     </w:p>
     <w:p>
@@ -449,7 +500,7 @@
           <w:color w:val="1B222A"/>
           <w:sz w:val="17"/>
         </w:rPr>
-        <w:t>Lead a student-run robotics nonprofit designing custom kits, beginner-facing Python/C++ libraries, and free applied-robotics camps for grades 3–8; oversee kit readiness, recruiting, grants, partnerships, and camp operations.</w:t>
+        <w:t>Lead a student-run robotics program providing free camps for grades 3–8; rebuilding the 2026-27 leadership team, training new officers, and preparing Kit V6 for testing and summer 2027 production while it remains under active development.</w:t>
       </w:r>
     </w:p>
     <w:p>
@@ -468,7 +519,7 @@
           <w:color w:val="1B222A"/>
           <w:sz w:val="17"/>
         </w:rPr>
-        <w:t>Technical Instructor - iCode, United Stream Foundation, Udemy</w:t>
+        <w:t>Programming &amp; AI Instructor - iCode</w:t>
       </w:r>
       <w:r>
         <w:rPr>
@@ -480,7 +531,7 @@
           <w:sz w:val="16"/>
         </w:rPr>
         <w:tab/>
-        <w:t>2024-Present</w:t>
+        <w:t>March 2026-Present</w:t>
       </w:r>
     </w:p>
     <w:p>
@@ -500,7 +551,7 @@
           <w:color w:val="1B222A"/>
           <w:sz w:val="17"/>
         </w:rPr>
-        <w:t>Teach programming, machine learning, Java/OOP, and applied cryptography; authored a 35-lecture course with 16 exercises and a deliberately vulnerable capstone evaluated through hidden and mutation-based tests.</w:t>
+        <w:t>Teach programming fundamentals and practical machine learning through hands-on exercises, guiding younger students as they design and debug their own projects.</w:t>
       </w:r>
     </w:p>
     <w:p>
@@ -604,7 +655,7 @@
           <w:color w:val="1B222A"/>
           <w:sz w:val="16"/>
         </w:rPr>
-        <w:t>CyberPatriot XVIII Open Division National Semifinalist; picoCTF 2026 #68 worldwide with a perfect team score; member of FRC Team 5417 when it won the 2025 FIRST Impact Award at the Fort Worth District Event and the 2025 Tomball District Event</w:t>
+        <w:t>CyberPatriot XVIII Open Division National Semifinalist; picoCTF 2026 #68 worldwide on a two-person team that solved all 70 challenges for 14,500/14,500 points (personally solved 60); member of FRC Team 5417 for its 2025 Fort Worth FIRST Impact Award and Tomball District Event win</w:t>
       </w:r>
     </w:p>
     <w:p>

</xml_diff>

<commit_message>
Add proof links to resume
</commit_message>
<xml_diff>
--- a/public/Jamal_Mammadzada_Resume.docx
+++ b/public/Jamal_Mammadzada_Resume.docx
@@ -55,15 +55,49 @@
       <w:r>
         <w:rPr>
           <w:rFonts w:ascii="Arial" w:hAnsi="Arial"/>
-          <w:b/>
+          <w:b w:val="0"/>
           <w:i w:val="0"/>
           <w:caps w:val="0"/>
-          <w:color w:val="2563EB"/>
+          <w:color w:val="5B6672"/>
           <w:sz w:val="15"/>
         </w:rPr>
         <w:tab/>
-        <w:t>github.com/jam2342</w:t>
       </w:r>
+      <w:hyperlink r:id="rId9" w:history="1">
+        <w:r>
+          <w:rPr>
+            <w:rFonts w:ascii="Arial" w:hAnsi="Arial"/>
+            <w:color w:val="2563EB"/>
+            <w:sz w:val="16"/>
+            <w:b/>
+            <w:u w:val="single"/>
+          </w:rPr>
+          <w:t>Portfolio</w:t>
+        </w:r>
+      </w:hyperlink>
+      <w:r>
+        <w:rPr>
+          <w:rFonts w:ascii="Arial" w:hAnsi="Arial"/>
+          <w:b w:val="0"/>
+          <w:i w:val="0"/>
+          <w:caps w:val="0"/>
+          <w:color w:val="5B6672"/>
+          <w:sz w:val="15"/>
+        </w:rPr>
+        <w:t xml:space="preserve">  |  </w:t>
+      </w:r>
+      <w:hyperlink r:id="rId10" w:history="1">
+        <w:r>
+          <w:rPr>
+            <w:rFonts w:ascii="Arial" w:hAnsi="Arial"/>
+            <w:color w:val="2563EB"/>
+            <w:sz w:val="16"/>
+            <w:b/>
+            <w:u w:val="single"/>
+          </w:rPr>
+          <w:t>GitHub</w:t>
+        </w:r>
+      </w:hyperlink>
     </w:p>
     <w:p>
       <w:pPr>
@@ -140,6 +174,29 @@
       <w:r>
         <w:rPr>
           <w:rFonts w:ascii="Arial" w:hAnsi="Arial"/>
+          <w:b w:val="0"/>
+          <w:i w:val="0"/>
+          <w:caps w:val="0"/>
+          <w:color w:val="5B6672"/>
+          <w:sz w:val="15"/>
+        </w:rPr>
+        <w:t xml:space="preserve">  </w:t>
+      </w:r>
+      <w:hyperlink r:id="rId11" w:history="1">
+        <w:r>
+          <w:rPr>
+            <w:rFonts w:ascii="Arial" w:hAnsi="Arial"/>
+            <w:color w:val="2563EB"/>
+            <w:sz w:val="15"/>
+            <w:b/>
+            <w:u w:val="single"/>
+          </w:rPr>
+          <w:t>source ↗</w:t>
+        </w:r>
+      </w:hyperlink>
+      <w:r>
+        <w:rPr>
+          <w:rFonts w:ascii="Arial" w:hAnsi="Arial"/>
           <w:b/>
           <w:i w:val="0"/>
           <w:caps w:val="0"/>
@@ -208,6 +265,29 @@
         </w:rPr>
         <w:t>Windows Hardening Framework - Sole Developer</w:t>
       </w:r>
+      <w:r>
+        <w:rPr>
+          <w:rFonts w:ascii="Arial" w:hAnsi="Arial"/>
+          <w:b w:val="0"/>
+          <w:i w:val="0"/>
+          <w:caps w:val="0"/>
+          <w:color w:val="5B6672"/>
+          <w:sz w:val="15"/>
+        </w:rPr>
+        <w:t xml:space="preserve">  </w:t>
+      </w:r>
+      <w:hyperlink r:id="rId12" w:history="1">
+        <w:r>
+          <w:rPr>
+            <w:rFonts w:ascii="Arial" w:hAnsi="Arial"/>
+            <w:color w:val="2563EB"/>
+            <w:sz w:val="15"/>
+            <w:b/>
+            <w:u w:val="single"/>
+          </w:rPr>
+          <w:t>case study ↗</w:t>
+        </w:r>
+      </w:hyperlink>
       <w:r>
         <w:rPr>
           <w:rFonts w:ascii="Arial" w:hAnsi="Arial"/>
@@ -282,6 +362,29 @@
       <w:r>
         <w:rPr>
           <w:rFonts w:ascii="Arial" w:hAnsi="Arial"/>
+          <w:b w:val="0"/>
+          <w:i w:val="0"/>
+          <w:caps w:val="0"/>
+          <w:color w:val="5B6672"/>
+          <w:sz w:val="15"/>
+        </w:rPr>
+        <w:t xml:space="preserve">  </w:t>
+      </w:r>
+      <w:hyperlink r:id="rId13" w:history="1">
+        <w:r>
+          <w:rPr>
+            <w:rFonts w:ascii="Arial" w:hAnsi="Arial"/>
+            <w:color w:val="2563EB"/>
+            <w:sz w:val="15"/>
+            <w:b/>
+            <w:u w:val="single"/>
+          </w:rPr>
+          <w:t>case study ↗</w:t>
+        </w:r>
+      </w:hyperlink>
+      <w:r>
+        <w:rPr>
+          <w:rFonts w:ascii="Arial" w:hAnsi="Arial"/>
           <w:b/>
           <w:i w:val="0"/>
           <w:caps w:val="0"/>
@@ -349,6 +452,29 @@
         </w:rPr>
         <w:t>Analytical Solvability of One-Dimensional SDEs - Independent Research</w:t>
       </w:r>
+      <w:r>
+        <w:rPr>
+          <w:rFonts w:ascii="Arial" w:hAnsi="Arial"/>
+          <w:b w:val="0"/>
+          <w:i w:val="0"/>
+          <w:caps w:val="0"/>
+          <w:color w:val="5B6672"/>
+          <w:sz w:val="15"/>
+        </w:rPr>
+        <w:t xml:space="preserve">  </w:t>
+      </w:r>
+      <w:hyperlink r:id="rId14" w:history="1">
+        <w:r>
+          <w:rPr>
+            <w:rFonts w:ascii="Arial" w:hAnsi="Arial"/>
+            <w:color w:val="2563EB"/>
+            <w:sz w:val="15"/>
+            <w:b/>
+            <w:u w:val="single"/>
+          </w:rPr>
+          <w:t>research ↗</w:t>
+        </w:r>
+      </w:hyperlink>
       <w:r>
         <w:rPr>
           <w:rFonts w:ascii="Arial" w:hAnsi="Arial"/>
@@ -473,6 +599,29 @@
       <w:r>
         <w:rPr>
           <w:rFonts w:ascii="Arial" w:hAnsi="Arial"/>
+          <w:b w:val="0"/>
+          <w:i w:val="0"/>
+          <w:caps w:val="0"/>
+          <w:color w:val="5B6672"/>
+          <w:sz w:val="15"/>
+        </w:rPr>
+        <w:t xml:space="preserve">  </w:t>
+      </w:r>
+      <w:hyperlink r:id="rId15" w:history="1">
+        <w:r>
+          <w:rPr>
+            <w:rFonts w:ascii="Arial" w:hAnsi="Arial"/>
+            <w:color w:val="2563EB"/>
+            <w:sz w:val="15"/>
+            <w:b/>
+            <w:u w:val="single"/>
+          </w:rPr>
+          <w:t>case study ↗</w:t>
+        </w:r>
+      </w:hyperlink>
+      <w:r>
+        <w:rPr>
+          <w:rFonts w:ascii="Arial" w:hAnsi="Arial"/>
           <w:b/>
           <w:i w:val="0"/>
           <w:caps w:val="0"/>
@@ -521,6 +670,29 @@
         </w:rPr>
         <w:t>Programming &amp; AI Instructor - iCode</w:t>
       </w:r>
+      <w:r>
+        <w:rPr>
+          <w:rFonts w:ascii="Arial" w:hAnsi="Arial"/>
+          <w:b w:val="0"/>
+          <w:i w:val="0"/>
+          <w:caps w:val="0"/>
+          <w:color w:val="5B6672"/>
+          <w:sz w:val="15"/>
+        </w:rPr>
+        <w:t xml:space="preserve">  </w:t>
+      </w:r>
+      <w:hyperlink r:id="rId16" w:history="1">
+        <w:r>
+          <w:rPr>
+            <w:rFonts w:ascii="Arial" w:hAnsi="Arial"/>
+            <w:color w:val="2563EB"/>
+            <w:sz w:val="15"/>
+            <w:b/>
+            <w:u w:val="single"/>
+          </w:rPr>
+          <w:t>experience ↗</w:t>
+        </w:r>
+      </w:hyperlink>
       <w:r>
         <w:rPr>
           <w:rFonts w:ascii="Arial" w:hAnsi="Arial"/>
@@ -786,7 +958,7 @@
       </w:r>
     </w:p>
     <w:sectPr>
-      <w:footerReference w:type="default" r:id="rId9"/>
+      <w:footerReference w:type="default" r:id="rId17"/>
       <w:pgSz w:w="12240" w:h="15840"/>
       <w:pgMar w:top="662" w:right="893" w:bottom="619" w:left="893" w:header="288" w:footer="288" w:gutter="0"/>
       <w:cols w:space="720"/>

</xml_diff>

<commit_message>
Add project visuals to resume
</commit_message>
<xml_diff>
--- a/public/Jamal_Mammadzada_Resume.docx
+++ b/public/Jamal_Mammadzada_Resume.docx
@@ -136,6 +136,227 @@
     </w:p>
     <w:p>
       <w:pPr>
+        <w:keepNext/>
+        <w:spacing w:before="44" w:after="24"/>
+        <w:jc w:val="center"/>
+      </w:pPr>
+      <w:r>
+        <w:drawing>
+          <wp:inline xmlns:a="http://schemas.openxmlformats.org/drawingml/2006/main" xmlns:pic="http://schemas.openxmlformats.org/drawingml/2006/picture">
+            <wp:extent cx="1069848" cy="601675"/>
+            <wp:docPr id="1" name="Picture 1" descr="frcmob project visual"/>
+            <wp:cNvGraphicFramePr>
+              <a:graphicFrameLocks noChangeAspect="1"/>
+            </wp:cNvGraphicFramePr>
+            <a:graphic>
+              <a:graphicData uri="http://schemas.openxmlformats.org/drawingml/2006/picture">
+                <pic:pic>
+                  <pic:nvPicPr>
+                    <pic:cNvPr id="0" name="frcmob.jpg"/>
+                    <pic:cNvPicPr/>
+                  </pic:nvPicPr>
+                  <pic:blipFill>
+                    <a:blip r:embed="rId11"/>
+                    <a:stretch>
+                      <a:fillRect/>
+                    </a:stretch>
+                  </pic:blipFill>
+                  <pic:spPr>
+                    <a:xfrm>
+                      <a:off x="0" y="0"/>
+                      <a:ext cx="1069848" cy="601675"/>
+                    </a:xfrm>
+                    <a:prstGeom prst="rect"/>
+                  </pic:spPr>
+                </pic:pic>
+              </a:graphicData>
+            </a:graphic>
+          </wp:inline>
+        </w:drawing>
+      </w:r>
+      <w:r>
+        <w:rPr>
+          <w:rFonts w:ascii="Arial" w:hAnsi="Arial"/>
+          <w:b w:val="0"/>
+          <w:i w:val="0"/>
+          <w:caps w:val="0"/>
+          <w:color w:val="5B6672"/>
+          <w:sz w:val="8"/>
+        </w:rPr>
+        <w:t xml:space="preserve"> </w:t>
+      </w:r>
+      <w:r>
+        <w:drawing>
+          <wp:inline xmlns:a="http://schemas.openxmlformats.org/drawingml/2006/main" xmlns:pic="http://schemas.openxmlformats.org/drawingml/2006/picture">
+            <wp:extent cx="1069848" cy="601675"/>
+            <wp:docPr id="2" name="Picture 2" descr="hardening project visual"/>
+            <wp:cNvGraphicFramePr>
+              <a:graphicFrameLocks noChangeAspect="1"/>
+            </wp:cNvGraphicFramePr>
+            <a:graphic>
+              <a:graphicData uri="http://schemas.openxmlformats.org/drawingml/2006/picture">
+                <pic:pic>
+                  <pic:nvPicPr>
+                    <pic:cNvPr id="0" name="hardening.jpg"/>
+                    <pic:cNvPicPr/>
+                  </pic:nvPicPr>
+                  <pic:blipFill>
+                    <a:blip r:embed="rId12"/>
+                    <a:stretch>
+                      <a:fillRect/>
+                    </a:stretch>
+                  </pic:blipFill>
+                  <pic:spPr>
+                    <a:xfrm>
+                      <a:off x="0" y="0"/>
+                      <a:ext cx="1069848" cy="601675"/>
+                    </a:xfrm>
+                    <a:prstGeom prst="rect"/>
+                  </pic:spPr>
+                </pic:pic>
+              </a:graphicData>
+            </a:graphic>
+          </wp:inline>
+        </w:drawing>
+      </w:r>
+      <w:r>
+        <w:rPr>
+          <w:rFonts w:ascii="Arial" w:hAnsi="Arial"/>
+          <w:b w:val="0"/>
+          <w:i w:val="0"/>
+          <w:caps w:val="0"/>
+          <w:color w:val="5B6672"/>
+          <w:sz w:val="8"/>
+        </w:rPr>
+        <w:t xml:space="preserve"> </w:t>
+      </w:r>
+      <w:r>
+        <w:drawing>
+          <wp:inline xmlns:a="http://schemas.openxmlformats.org/drawingml/2006/main" xmlns:pic="http://schemas.openxmlformats.org/drawingml/2006/picture">
+            <wp:extent cx="1069848" cy="601675"/>
+            <wp:docPr id="3" name="Picture 3" descr="cryptography project visual"/>
+            <wp:cNvGraphicFramePr>
+              <a:graphicFrameLocks noChangeAspect="1"/>
+            </wp:cNvGraphicFramePr>
+            <a:graphic>
+              <a:graphicData uri="http://schemas.openxmlformats.org/drawingml/2006/picture">
+                <pic:pic>
+                  <pic:nvPicPr>
+                    <pic:cNvPr id="0" name="cryptography.jpg"/>
+                    <pic:cNvPicPr/>
+                  </pic:nvPicPr>
+                  <pic:blipFill>
+                    <a:blip r:embed="rId13"/>
+                    <a:stretch>
+                      <a:fillRect/>
+                    </a:stretch>
+                  </pic:blipFill>
+                  <pic:spPr>
+                    <a:xfrm>
+                      <a:off x="0" y="0"/>
+                      <a:ext cx="1069848" cy="601675"/>
+                    </a:xfrm>
+                    <a:prstGeom prst="rect"/>
+                  </pic:spPr>
+                </pic:pic>
+              </a:graphicData>
+            </a:graphic>
+          </wp:inline>
+        </w:drawing>
+      </w:r>
+      <w:r>
+        <w:rPr>
+          <w:rFonts w:ascii="Arial" w:hAnsi="Arial"/>
+          <w:b w:val="0"/>
+          <w:i w:val="0"/>
+          <w:caps w:val="0"/>
+          <w:color w:val="5B6672"/>
+          <w:sz w:val="8"/>
+        </w:rPr>
+        <w:t xml:space="preserve"> </w:t>
+      </w:r>
+      <w:r>
+        <w:drawing>
+          <wp:inline xmlns:a="http://schemas.openxmlformats.org/drawingml/2006/main" xmlns:pic="http://schemas.openxmlformats.org/drawingml/2006/picture">
+            <wp:extent cx="1069848" cy="601675"/>
+            <wp:docPr id="4" name="Picture 4" descr="research project visual"/>
+            <wp:cNvGraphicFramePr>
+              <a:graphicFrameLocks noChangeAspect="1"/>
+            </wp:cNvGraphicFramePr>
+            <a:graphic>
+              <a:graphicData uri="http://schemas.openxmlformats.org/drawingml/2006/picture">
+                <pic:pic>
+                  <pic:nvPicPr>
+                    <pic:cNvPr id="0" name="research.jpg"/>
+                    <pic:cNvPicPr/>
+                  </pic:nvPicPr>
+                  <pic:blipFill>
+                    <a:blip r:embed="rId14"/>
+                    <a:stretch>
+                      <a:fillRect/>
+                    </a:stretch>
+                  </pic:blipFill>
+                  <pic:spPr>
+                    <a:xfrm>
+                      <a:off x="0" y="0"/>
+                      <a:ext cx="1069848" cy="601675"/>
+                    </a:xfrm>
+                    <a:prstGeom prst="rect"/>
+                  </pic:spPr>
+                </pic:pic>
+              </a:graphicData>
+            </a:graphic>
+          </wp:inline>
+        </w:drawing>
+      </w:r>
+      <w:r>
+        <w:rPr>
+          <w:rFonts w:ascii="Arial" w:hAnsi="Arial"/>
+          <w:b w:val="0"/>
+          <w:i w:val="0"/>
+          <w:caps w:val="0"/>
+          <w:color w:val="5B6672"/>
+          <w:sz w:val="8"/>
+        </w:rPr>
+        <w:t xml:space="preserve"> </w:t>
+      </w:r>
+      <w:r>
+        <w:drawing>
+          <wp:inline xmlns:a="http://schemas.openxmlformats.org/drawingml/2006/main" xmlns:pic="http://schemas.openxmlformats.org/drawingml/2006/picture">
+            <wp:extent cx="1069848" cy="601675"/>
+            <wp:docPr id="5" name="Picture 5" descr="eaglets project visual"/>
+            <wp:cNvGraphicFramePr>
+              <a:graphicFrameLocks noChangeAspect="1"/>
+            </wp:cNvGraphicFramePr>
+            <a:graphic>
+              <a:graphicData uri="http://schemas.openxmlformats.org/drawingml/2006/picture">
+                <pic:pic>
+                  <pic:nvPicPr>
+                    <pic:cNvPr id="0" name="eaglets.jpg"/>
+                    <pic:cNvPicPr/>
+                  </pic:nvPicPr>
+                  <pic:blipFill>
+                    <a:blip r:embed="rId15"/>
+                    <a:stretch>
+                      <a:fillRect/>
+                    </a:stretch>
+                  </pic:blipFill>
+                  <pic:spPr>
+                    <a:xfrm>
+                      <a:off x="0" y="0"/>
+                      <a:ext cx="1069848" cy="601675"/>
+                    </a:xfrm>
+                    <a:prstGeom prst="rect"/>
+                  </pic:spPr>
+                </pic:pic>
+              </a:graphicData>
+            </a:graphic>
+          </wp:inline>
+        </w:drawing>
+      </w:r>
+    </w:p>
+    <w:p>
+      <w:pPr>
         <w:pStyle w:val="Heading1"/>
         <w:pBdr>
           <w:bottom w:val="single" w:sz="9" w:space="2" w:color="2563EB"/>
@@ -182,7 +403,7 @@
         </w:rPr>
         <w:t xml:space="preserve">  </w:t>
       </w:r>
-      <w:hyperlink r:id="rId11" w:history="1">
+      <w:hyperlink r:id="rId16" w:history="1">
         <w:r>
           <w:rPr>
             <w:rFonts w:ascii="Arial" w:hAnsi="Arial"/>
@@ -276,7 +497,7 @@
         </w:rPr>
         <w:t xml:space="preserve">  </w:t>
       </w:r>
-      <w:hyperlink r:id="rId12" w:history="1">
+      <w:hyperlink r:id="rId17" w:history="1">
         <w:r>
           <w:rPr>
             <w:rFonts w:ascii="Arial" w:hAnsi="Arial"/>
@@ -370,7 +591,7 @@
         </w:rPr>
         <w:t xml:space="preserve">  </w:t>
       </w:r>
-      <w:hyperlink r:id="rId13" w:history="1">
+      <w:hyperlink r:id="rId18" w:history="1">
         <w:r>
           <w:rPr>
             <w:rFonts w:ascii="Arial" w:hAnsi="Arial"/>
@@ -463,7 +684,7 @@
         </w:rPr>
         <w:t xml:space="preserve">  </w:t>
       </w:r>
-      <w:hyperlink r:id="rId14" w:history="1">
+      <w:hyperlink r:id="rId19" w:history="1">
         <w:r>
           <w:rPr>
             <w:rFonts w:ascii="Arial" w:hAnsi="Arial"/>
@@ -485,7 +706,7 @@
           <w:sz w:val="16"/>
         </w:rPr>
         <w:tab/>
-        <w:t>2026-Present</w:t>
+        <w:t>2025-Present</w:t>
       </w:r>
     </w:p>
     <w:p>
@@ -607,7 +828,7 @@
         </w:rPr>
         <w:t xml:space="preserve">  </w:t>
       </w:r>
-      <w:hyperlink r:id="rId15" w:history="1">
+      <w:hyperlink r:id="rId20" w:history="1">
         <w:r>
           <w:rPr>
             <w:rFonts w:ascii="Arial" w:hAnsi="Arial"/>
@@ -681,7 +902,7 @@
         </w:rPr>
         <w:t xml:space="preserve">  </w:t>
       </w:r>
-      <w:hyperlink r:id="rId16" w:history="1">
+      <w:hyperlink r:id="rId21" w:history="1">
         <w:r>
           <w:rPr>
             <w:rFonts w:ascii="Arial" w:hAnsi="Arial"/>
@@ -958,7 +1179,7 @@
       </w:r>
     </w:p>
     <w:sectPr>
-      <w:footerReference w:type="default" r:id="rId17"/>
+      <w:footerReference w:type="default" r:id="rId22"/>
       <w:pgSz w:w="12240" w:h="15840"/>
       <w:pgMar w:top="662" w:right="893" w:bottom="619" w:left="893" w:header="288" w:footer="288" w:gutter="0"/>
       <w:cols w:space="720"/>

</xml_diff>

<commit_message>
offer standard and visual resumes
</commit_message>
<xml_diff>
--- a/public/Jamal_Mammadzada_Resume.docx
+++ b/public/Jamal_Mammadzada_Resume.docx
@@ -136,227 +136,6 @@
     </w:p>
     <w:p>
       <w:pPr>
-        <w:keepNext/>
-        <w:spacing w:before="44" w:after="24"/>
-        <w:jc w:val="center"/>
-      </w:pPr>
-      <w:r>
-        <w:drawing>
-          <wp:inline xmlns:a="http://schemas.openxmlformats.org/drawingml/2006/main" xmlns:pic="http://schemas.openxmlformats.org/drawingml/2006/picture">
-            <wp:extent cx="1069848" cy="601675"/>
-            <wp:docPr id="1" name="Picture 1" descr="frcmob project visual"/>
-            <wp:cNvGraphicFramePr>
-              <a:graphicFrameLocks noChangeAspect="1"/>
-            </wp:cNvGraphicFramePr>
-            <a:graphic>
-              <a:graphicData uri="http://schemas.openxmlformats.org/drawingml/2006/picture">
-                <pic:pic>
-                  <pic:nvPicPr>
-                    <pic:cNvPr id="0" name="frcmob.jpg"/>
-                    <pic:cNvPicPr/>
-                  </pic:nvPicPr>
-                  <pic:blipFill>
-                    <a:blip r:embed="rId11"/>
-                    <a:stretch>
-                      <a:fillRect/>
-                    </a:stretch>
-                  </pic:blipFill>
-                  <pic:spPr>
-                    <a:xfrm>
-                      <a:off x="0" y="0"/>
-                      <a:ext cx="1069848" cy="601675"/>
-                    </a:xfrm>
-                    <a:prstGeom prst="rect"/>
-                  </pic:spPr>
-                </pic:pic>
-              </a:graphicData>
-            </a:graphic>
-          </wp:inline>
-        </w:drawing>
-      </w:r>
-      <w:r>
-        <w:rPr>
-          <w:rFonts w:ascii="Arial" w:hAnsi="Arial"/>
-          <w:b w:val="0"/>
-          <w:i w:val="0"/>
-          <w:caps w:val="0"/>
-          <w:color w:val="5B6672"/>
-          <w:sz w:val="8"/>
-        </w:rPr>
-        <w:t xml:space="preserve"> </w:t>
-      </w:r>
-      <w:r>
-        <w:drawing>
-          <wp:inline xmlns:a="http://schemas.openxmlformats.org/drawingml/2006/main" xmlns:pic="http://schemas.openxmlformats.org/drawingml/2006/picture">
-            <wp:extent cx="1069848" cy="601675"/>
-            <wp:docPr id="2" name="Picture 2" descr="hardening project visual"/>
-            <wp:cNvGraphicFramePr>
-              <a:graphicFrameLocks noChangeAspect="1"/>
-            </wp:cNvGraphicFramePr>
-            <a:graphic>
-              <a:graphicData uri="http://schemas.openxmlformats.org/drawingml/2006/picture">
-                <pic:pic>
-                  <pic:nvPicPr>
-                    <pic:cNvPr id="0" name="hardening.jpg"/>
-                    <pic:cNvPicPr/>
-                  </pic:nvPicPr>
-                  <pic:blipFill>
-                    <a:blip r:embed="rId12"/>
-                    <a:stretch>
-                      <a:fillRect/>
-                    </a:stretch>
-                  </pic:blipFill>
-                  <pic:spPr>
-                    <a:xfrm>
-                      <a:off x="0" y="0"/>
-                      <a:ext cx="1069848" cy="601675"/>
-                    </a:xfrm>
-                    <a:prstGeom prst="rect"/>
-                  </pic:spPr>
-                </pic:pic>
-              </a:graphicData>
-            </a:graphic>
-          </wp:inline>
-        </w:drawing>
-      </w:r>
-      <w:r>
-        <w:rPr>
-          <w:rFonts w:ascii="Arial" w:hAnsi="Arial"/>
-          <w:b w:val="0"/>
-          <w:i w:val="0"/>
-          <w:caps w:val="0"/>
-          <w:color w:val="5B6672"/>
-          <w:sz w:val="8"/>
-        </w:rPr>
-        <w:t xml:space="preserve"> </w:t>
-      </w:r>
-      <w:r>
-        <w:drawing>
-          <wp:inline xmlns:a="http://schemas.openxmlformats.org/drawingml/2006/main" xmlns:pic="http://schemas.openxmlformats.org/drawingml/2006/picture">
-            <wp:extent cx="1069848" cy="601675"/>
-            <wp:docPr id="3" name="Picture 3" descr="cryptography project visual"/>
-            <wp:cNvGraphicFramePr>
-              <a:graphicFrameLocks noChangeAspect="1"/>
-            </wp:cNvGraphicFramePr>
-            <a:graphic>
-              <a:graphicData uri="http://schemas.openxmlformats.org/drawingml/2006/picture">
-                <pic:pic>
-                  <pic:nvPicPr>
-                    <pic:cNvPr id="0" name="cryptography.jpg"/>
-                    <pic:cNvPicPr/>
-                  </pic:nvPicPr>
-                  <pic:blipFill>
-                    <a:blip r:embed="rId13"/>
-                    <a:stretch>
-                      <a:fillRect/>
-                    </a:stretch>
-                  </pic:blipFill>
-                  <pic:spPr>
-                    <a:xfrm>
-                      <a:off x="0" y="0"/>
-                      <a:ext cx="1069848" cy="601675"/>
-                    </a:xfrm>
-                    <a:prstGeom prst="rect"/>
-                  </pic:spPr>
-                </pic:pic>
-              </a:graphicData>
-            </a:graphic>
-          </wp:inline>
-        </w:drawing>
-      </w:r>
-      <w:r>
-        <w:rPr>
-          <w:rFonts w:ascii="Arial" w:hAnsi="Arial"/>
-          <w:b w:val="0"/>
-          <w:i w:val="0"/>
-          <w:caps w:val="0"/>
-          <w:color w:val="5B6672"/>
-          <w:sz w:val="8"/>
-        </w:rPr>
-        <w:t xml:space="preserve"> </w:t>
-      </w:r>
-      <w:r>
-        <w:drawing>
-          <wp:inline xmlns:a="http://schemas.openxmlformats.org/drawingml/2006/main" xmlns:pic="http://schemas.openxmlformats.org/drawingml/2006/picture">
-            <wp:extent cx="1069848" cy="601675"/>
-            <wp:docPr id="4" name="Picture 4" descr="research project visual"/>
-            <wp:cNvGraphicFramePr>
-              <a:graphicFrameLocks noChangeAspect="1"/>
-            </wp:cNvGraphicFramePr>
-            <a:graphic>
-              <a:graphicData uri="http://schemas.openxmlformats.org/drawingml/2006/picture">
-                <pic:pic>
-                  <pic:nvPicPr>
-                    <pic:cNvPr id="0" name="research.jpg"/>
-                    <pic:cNvPicPr/>
-                  </pic:nvPicPr>
-                  <pic:blipFill>
-                    <a:blip r:embed="rId14"/>
-                    <a:stretch>
-                      <a:fillRect/>
-                    </a:stretch>
-                  </pic:blipFill>
-                  <pic:spPr>
-                    <a:xfrm>
-                      <a:off x="0" y="0"/>
-                      <a:ext cx="1069848" cy="601675"/>
-                    </a:xfrm>
-                    <a:prstGeom prst="rect"/>
-                  </pic:spPr>
-                </pic:pic>
-              </a:graphicData>
-            </a:graphic>
-          </wp:inline>
-        </w:drawing>
-      </w:r>
-      <w:r>
-        <w:rPr>
-          <w:rFonts w:ascii="Arial" w:hAnsi="Arial"/>
-          <w:b w:val="0"/>
-          <w:i w:val="0"/>
-          <w:caps w:val="0"/>
-          <w:color w:val="5B6672"/>
-          <w:sz w:val="8"/>
-        </w:rPr>
-        <w:t xml:space="preserve"> </w:t>
-      </w:r>
-      <w:r>
-        <w:drawing>
-          <wp:inline xmlns:a="http://schemas.openxmlformats.org/drawingml/2006/main" xmlns:pic="http://schemas.openxmlformats.org/drawingml/2006/picture">
-            <wp:extent cx="1069848" cy="601675"/>
-            <wp:docPr id="5" name="Picture 5" descr="eaglets project visual"/>
-            <wp:cNvGraphicFramePr>
-              <a:graphicFrameLocks noChangeAspect="1"/>
-            </wp:cNvGraphicFramePr>
-            <a:graphic>
-              <a:graphicData uri="http://schemas.openxmlformats.org/drawingml/2006/picture">
-                <pic:pic>
-                  <pic:nvPicPr>
-                    <pic:cNvPr id="0" name="eaglets.jpg"/>
-                    <pic:cNvPicPr/>
-                  </pic:nvPicPr>
-                  <pic:blipFill>
-                    <a:blip r:embed="rId15"/>
-                    <a:stretch>
-                      <a:fillRect/>
-                    </a:stretch>
-                  </pic:blipFill>
-                  <pic:spPr>
-                    <a:xfrm>
-                      <a:off x="0" y="0"/>
-                      <a:ext cx="1069848" cy="601675"/>
-                    </a:xfrm>
-                    <a:prstGeom prst="rect"/>
-                  </pic:spPr>
-                </pic:pic>
-              </a:graphicData>
-            </a:graphic>
-          </wp:inline>
-        </w:drawing>
-      </w:r>
-    </w:p>
-    <w:p>
-      <w:pPr>
         <w:pStyle w:val="Heading1"/>
         <w:pBdr>
           <w:bottom w:val="single" w:sz="9" w:space="2" w:color="2563EB"/>
@@ -403,7 +182,7 @@
         </w:rPr>
         <w:t xml:space="preserve">  </w:t>
       </w:r>
-      <w:hyperlink r:id="rId16" w:history="1">
+      <w:hyperlink r:id="rId11" w:history="1">
         <w:r>
           <w:rPr>
             <w:rFonts w:ascii="Arial" w:hAnsi="Arial"/>
@@ -497,7 +276,7 @@
         </w:rPr>
         <w:t xml:space="preserve">  </w:t>
       </w:r>
-      <w:hyperlink r:id="rId17" w:history="1">
+      <w:hyperlink r:id="rId12" w:history="1">
         <w:r>
           <w:rPr>
             <w:rFonts w:ascii="Arial" w:hAnsi="Arial"/>
@@ -591,7 +370,7 @@
         </w:rPr>
         <w:t xml:space="preserve">  </w:t>
       </w:r>
-      <w:hyperlink r:id="rId18" w:history="1">
+      <w:hyperlink r:id="rId13" w:history="1">
         <w:r>
           <w:rPr>
             <w:rFonts w:ascii="Arial" w:hAnsi="Arial"/>
@@ -684,7 +463,7 @@
         </w:rPr>
         <w:t xml:space="preserve">  </w:t>
       </w:r>
-      <w:hyperlink r:id="rId19" w:history="1">
+      <w:hyperlink r:id="rId14" w:history="1">
         <w:r>
           <w:rPr>
             <w:rFonts w:ascii="Arial" w:hAnsi="Arial"/>
@@ -828,7 +607,7 @@
         </w:rPr>
         <w:t xml:space="preserve">  </w:t>
       </w:r>
-      <w:hyperlink r:id="rId20" w:history="1">
+      <w:hyperlink r:id="rId15" w:history="1">
         <w:r>
           <w:rPr>
             <w:rFonts w:ascii="Arial" w:hAnsi="Arial"/>
@@ -902,7 +681,7 @@
         </w:rPr>
         <w:t xml:space="preserve">  </w:t>
       </w:r>
-      <w:hyperlink r:id="rId21" w:history="1">
+      <w:hyperlink r:id="rId16" w:history="1">
         <w:r>
           <w:rPr>
             <w:rFonts w:ascii="Arial" w:hAnsi="Arial"/>
@@ -1179,7 +958,7 @@
       </w:r>
     </w:p>
     <w:sectPr>
-      <w:footerReference w:type="default" r:id="rId22"/>
+      <w:footerReference w:type="default" r:id="rId17"/>
       <w:pgSz w:w="12240" w:h="15840"/>
       <w:pgMar w:top="662" w:right="893" w:bottom="619" w:left="893" w:header="288" w:footer="288" w:gutter="0"/>
       <w:cols w:space="720"/>

</xml_diff>